<commit_message>
data(dev): refresh completo de datos hasta 26-abr-2026
Sheet CRM:
- Re-bajadas las 4 hojas individuales (Autos, Motos, Arriendo, Viajes)
- Ultimo dia con data: 2026-04-26 (Autos: 206 leads SF ese dia)
- Cumplimiento global: 46.1% -> 59.1% (+13pp con 2 dias mas de SF)
- Leads SF: 19.971 -> 25.582 (+5.611)
- CPL Negocio: $5.25 -> $4.25

Google Ads MCC (re-extraccion):
- 6 cuentas re-scrapeadas (Autos, Motos, Arrendamiento, Viajes, Salud Animal, Salud Para Dos)
- Mas campanias detectadas: 4-10 por cuenta
- Optimization scores y cuotas de impresion actualizadas

Re-generados: data.json, data_paid_media.json, data_crm.json,
suratech_informe_ejecutivo.docx, suratech_data_consolidado.xlsx,
TOP 10 recomendaciones, oportunidades cross-canal, insights CRM.

Co-Authored-By: Claude Opus 4.7 (1M context) <noreply@anthropic.com>
</commit_message>
<xml_diff>
--- a/outputs/suratech_informe_ejecutivo.docx
+++ b/outputs/suratech_informe_ejecutivo.docx
@@ -64,7 +64,7 @@
           <w:color w:val="1A1A1A"/>
           <w:sz w:val="22"/>
         </w:rPr>
-        <w:t>Inversión total: $104,893.14 USD (Google $77,352 / Meta $24,858 / Bing $2,683)</w:t>
+        <w:t>Inversión total: $108,712.98 USD (Google $77,352 / Meta $28,142 / Bing $3,219)</w:t>
       </w:r>
     </w:p>
     <w:p>
@@ -75,7 +75,7 @@
           <w:color w:val="1A1A1A"/>
           <w:sz w:val="22"/>
         </w:rPr>
-        <w:t>RECIBIDOS (SF): 19,971 leads reales de 43,290 requeridos</w:t>
+        <w:t>RECIBIDOS (SF): 25,582 leads reales de 43,290 requeridos</w:t>
       </w:r>
     </w:p>
     <w:p>
@@ -86,17 +86,17 @@
           <w:color w:val="1A1A1A"/>
           <w:sz w:val="22"/>
         </w:rPr>
-        <w:t>Total Pauta: 12,904 (cumplimiento Pauta/Req: 29.8%)</w:t>
+        <w:t>Total Pauta: 13,537 (cumplimiento Pauta/Req: 31.3%)</w:t>
       </w:r>
     </w:p>
     <w:p>
       <w:r>
         <w:rPr>
           <w:b/>
-          <w:color w:val="DC2626"/>
+          <w:color w:val="F59E0B"/>
           <w:sz w:val="22"/>
         </w:rPr>
-        <w:t>Cumplimiento SF/Req: 46.1% (vs 70% transcurrido del mes)</w:t>
+        <w:t>Cumplimiento SF/Req: 59.1% (vs 70% transcurrido del mes)</w:t>
       </w:r>
     </w:p>
     <w:p>
@@ -107,7 +107,7 @@
           <w:color w:val="1A1A1A"/>
           <w:sz w:val="22"/>
         </w:rPr>
-        <w:t>CPL Negocio promedio (SF): $5.25 USD</w:t>
+        <w:t>CPL Negocio promedio (SF): $4.25 USD</w:t>
       </w:r>
     </w:p>
     <w:p>
@@ -225,10 +225,10 @@
       <w:r>
         <w:rPr>
           <w:b/>
-          <w:color w:val="F59E0B"/>
+          <w:color w:val="10B981"/>
           <w:sz w:val="24"/>
         </w:rPr>
-        <w:t xml:space="preserve">  EN RIESGO · Cumplimiento SF/Req 56.7%</w:t>
+        <w:t xml:space="preserve">  EN OBJETIVO · Cumplimiento SF/Req 73.9%</w:t>
       </w:r>
     </w:p>
     <w:p>
@@ -239,7 +239,7 @@
           <w:color w:val="1A1A1A"/>
           <w:sz w:val="22"/>
         </w:rPr>
-        <w:t xml:space="preserve">  RECIBIDOS (SF): 5,564 / Requeridos: 9,810</w:t>
+        <w:t xml:space="preserve">  RECIBIDOS (SF): 7,251 / Requeridos: 9,810</w:t>
       </w:r>
     </w:p>
     <w:p>
@@ -250,7 +250,7 @@
           <w:color w:val="1A1A1A"/>
           <w:sz w:val="22"/>
         </w:rPr>
-        <w:t xml:space="preserve">  Total Pauta: 7,180 (Pauta/Req: 73.2%)</w:t>
+        <w:t xml:space="preserve">  Total Pauta: 7,504 (Pauta/Req: 76.5%)</w:t>
       </w:r>
     </w:p>
     <w:p>
@@ -261,7 +261,7 @@
           <w:color w:val="1A1A1A"/>
           <w:sz w:val="22"/>
         </w:rPr>
-        <w:t xml:space="preserve">  CPL Negocio (SF): $6.51</w:t>
+        <w:t xml:space="preserve">  CPL Negocio (SF): $5.17</w:t>
       </w:r>
     </w:p>
     <w:p>
@@ -272,7 +272,7 @@
           <w:color w:val="1A1A1A"/>
           <w:sz w:val="22"/>
         </w:rPr>
-        <w:t xml:space="preserve">  Inversión: Google $26,132 / Meta $9,112 / Bing $973</w:t>
+        <w:t xml:space="preserve">  Inversión: Google $26,132 / Meta $10,244 / Bing $1,120</w:t>
       </w:r>
     </w:p>
     <w:p>
@@ -283,7 +283,7 @@
           <w:color w:val="1A1A1A"/>
           <w:sz w:val="22"/>
         </w:rPr>
-        <w:t xml:space="preserve">  Leads inferidos: Google 4,337 · Meta 2,293 · Bing 550</w:t>
+        <w:t xml:space="preserve">  Leads inferidos: Google 4,337 · Meta 2,544 · Bing 623</w:t>
       </w:r>
     </w:p>
     <w:p>
@@ -294,7 +294,7 @@
           <w:color w:val="1A1A1A"/>
           <w:sz w:val="22"/>
         </w:rPr>
-        <w:t xml:space="preserve">  Google Ads (extractor MCC): $26,252 · 4,824 conv · 4 campañas</w:t>
+        <w:t xml:space="preserve">  Google Ads (extractor MCC): $26,253 · 4,846 conv · 4 campañas</w:t>
       </w:r>
     </w:p>
     <w:p>
@@ -314,10 +314,10 @@
       <w:r>
         <w:rPr>
           <w:b/>
-          <w:color w:val="F59E0B"/>
+          <w:color w:val="10B981"/>
           <w:sz w:val="24"/>
         </w:rPr>
-        <w:t xml:space="preserve">  EN RIESGO · Cumplimiento SF/Req 55.4%</w:t>
+        <w:t xml:space="preserve">  EN OBJETIVO · Cumplimiento SF/Req 69.5%</w:t>
       </w:r>
     </w:p>
     <w:p>
@@ -328,7 +328,7 @@
           <w:color w:val="1A1A1A"/>
           <w:sz w:val="22"/>
         </w:rPr>
-        <w:t xml:space="preserve">  RECIBIDOS (SF): 7,973 / Requeridos: 14,400</w:t>
+        <w:t xml:space="preserve">  RECIBIDOS (SF): 10,014 / Requeridos: 14,400</w:t>
       </w:r>
     </w:p>
     <w:p>
@@ -339,7 +339,7 @@
           <w:color w:val="1A1A1A"/>
           <w:sz w:val="22"/>
         </w:rPr>
-        <w:t xml:space="preserve">  Total Pauta: 2,194 (Pauta/Req: 15.2%)</w:t>
+        <w:t xml:space="preserve">  Total Pauta: 2,348 (Pauta/Req: 16.3%)</w:t>
       </w:r>
     </w:p>
     <w:p>
@@ -350,7 +350,7 @@
           <w:color w:val="1A1A1A"/>
           <w:sz w:val="22"/>
         </w:rPr>
-        <w:t xml:space="preserve">  CPL Negocio (SF): $2.76</w:t>
+        <w:t xml:space="preserve">  CPL Negocio (SF): $2.29</w:t>
       </w:r>
     </w:p>
     <w:p>
@@ -361,7 +361,7 @@
           <w:color w:val="1A1A1A"/>
           <w:sz w:val="22"/>
         </w:rPr>
-        <w:t xml:space="preserve">  Inversión: Google $15,555 / Meta $5,825 / Bing $659</w:t>
+        <w:t xml:space="preserve">  Inversión: Google $15,555 / Meta $6,629 / Bing $753</w:t>
       </w:r>
     </w:p>
     <w:p>
@@ -372,7 +372,7 @@
           <w:color w:val="1A1A1A"/>
           <w:sz w:val="22"/>
         </w:rPr>
-        <w:t xml:space="preserve">  Leads inferidos: Google 1,117 · Meta 1,043 · Bing 32</w:t>
+        <w:t xml:space="preserve">  Leads inferidos: Google 1,117 · Meta 1,192 · Bing 37</w:t>
       </w:r>
     </w:p>
     <w:p>
@@ -383,7 +383,7 @@
           <w:color w:val="1A1A1A"/>
           <w:sz w:val="22"/>
         </w:rPr>
-        <w:t xml:space="preserve">  Google Ads (extractor MCC): $15,788 · 0 conv · 4 campañas</w:t>
+        <w:t xml:space="preserve">  Google Ads (extractor MCC): $15,788 · 1,342 conv · 4 campañas</w:t>
       </w:r>
     </w:p>
     <w:p>
@@ -406,7 +406,7 @@
           <w:color w:val="DC2626"/>
           <w:sz w:val="24"/>
         </w:rPr>
-        <w:t xml:space="preserve">  CRÍTICO · Cumplimiento SF/Req 32.2%</w:t>
+        <w:t xml:space="preserve">  CRÍTICO · Cumplimiento SF/Req 41.6%</w:t>
       </w:r>
     </w:p>
     <w:p>
@@ -417,7 +417,7 @@
           <w:color w:val="1A1A1A"/>
           <w:sz w:val="22"/>
         </w:rPr>
-        <w:t xml:space="preserve">  RECIBIDOS (SF): 5,285 / Requeridos: 16,410</w:t>
+        <w:t xml:space="preserve">  RECIBIDOS (SF): 6,833 / Requeridos: 16,410</w:t>
       </w:r>
     </w:p>
     <w:p>
@@ -428,7 +428,7 @@
           <w:color w:val="1A1A1A"/>
           <w:sz w:val="22"/>
         </w:rPr>
-        <w:t xml:space="preserve">  Total Pauta: 3,250 (Pauta/Req: 19.8%)</w:t>
+        <w:t xml:space="preserve">  Total Pauta: 3,396 (Pauta/Req: 20.7%)</w:t>
       </w:r>
     </w:p>
     <w:p>
@@ -439,7 +439,7 @@
           <w:color w:val="1A1A1A"/>
           <w:sz w:val="22"/>
         </w:rPr>
-        <w:t xml:space="preserve">  CPL Negocio (SF): $6.99</w:t>
+        <w:t xml:space="preserve">  CPL Negocio (SF): $5.58</w:t>
       </w:r>
     </w:p>
     <w:p>
@@ -450,7 +450,7 @@
           <w:color w:val="1A1A1A"/>
           <w:sz w:val="22"/>
         </w:rPr>
-        <w:t xml:space="preserve">  Inversión: Google $28,902 / Meta $7,148 / Bing $895</w:t>
+        <w:t xml:space="preserve">  Inversión: Google $28,902 / Meta $8,083 / Bing $1,167</w:t>
       </w:r>
     </w:p>
     <w:p>
@@ -461,7 +461,7 @@
           <w:color w:val="1A1A1A"/>
           <w:sz w:val="22"/>
         </w:rPr>
-        <w:t xml:space="preserve">  Leads inferidos: Google 1,870 · Meta 1,363 · Bing 15</w:t>
+        <w:t xml:space="preserve">  Leads inferidos: Google 1,870 · Meta 1,508 · Bing 16</w:t>
       </w:r>
     </w:p>
     <w:p>
@@ -472,7 +472,7 @@
           <w:color w:val="1A1A1A"/>
           <w:sz w:val="22"/>
         </w:rPr>
-        <w:t xml:space="preserve">  Google Ads (extractor MCC): $27,828 · 2,296 conv · 3 campañas</w:t>
+        <w:t xml:space="preserve">  Google Ads (extractor MCC): $27,829 · 2,322 conv · 3 campañas</w:t>
       </w:r>
     </w:p>
     <w:p>
@@ -495,7 +495,7 @@
           <w:color w:val="F59E0B"/>
           <w:sz w:val="24"/>
         </w:rPr>
-        <w:t xml:space="preserve">  EN RIESGO · Cumplimiento SF/Req 43.0%</w:t>
+        <w:t xml:space="preserve">  EN RIESGO · Cumplimiento SF/Req 55.6%</w:t>
       </w:r>
     </w:p>
     <w:p>
@@ -506,7 +506,7 @@
           <w:color w:val="1A1A1A"/>
           <w:sz w:val="22"/>
         </w:rPr>
-        <w:t xml:space="preserve">  RECIBIDOS (SF): 1,149 / Requeridos: 2,670</w:t>
+        <w:t xml:space="preserve">  RECIBIDOS (SF): 1,484 / Requeridos: 2,670</w:t>
       </w:r>
     </w:p>
     <w:p>
@@ -517,7 +517,7 @@
           <w:color w:val="1A1A1A"/>
           <w:sz w:val="22"/>
         </w:rPr>
-        <w:t xml:space="preserve">  Total Pauta: 280 (Pauta/Req: 10.5%)</w:t>
+        <w:t xml:space="preserve">  Total Pauta: 289 (Pauta/Req: 10.8%)</w:t>
       </w:r>
     </w:p>
     <w:p>
@@ -528,7 +528,7 @@
           <w:color w:val="1A1A1A"/>
           <w:sz w:val="22"/>
         </w:rPr>
-        <w:t xml:space="preserve">  CPL Negocio (SF): $8.43</w:t>
+        <w:t xml:space="preserve">  CPL Negocio (SF): $6.82</w:t>
       </w:r>
     </w:p>
     <w:p>
@@ -539,7 +539,7 @@
           <w:color w:val="1A1A1A"/>
           <w:sz w:val="22"/>
         </w:rPr>
-        <w:t xml:space="preserve">  Inversión: Google $6,762 / Meta $2,772 / Bing $157</w:t>
+        <w:t xml:space="preserve">  Inversión: Google $6,762 / Meta $3,186 / Bing $178</w:t>
       </w:r>
     </w:p>
     <w:p>
@@ -550,7 +550,7 @@
           <w:color w:val="1A1A1A"/>
           <w:sz w:val="22"/>
         </w:rPr>
-        <w:t xml:space="preserve">  Leads inferidos: Google 204 · Meta 74 · Bing 0</w:t>
+        <w:t xml:space="preserve">  Leads inferidos: Google 204 · Meta 83 · Bing 0</w:t>
       </w:r>
     </w:p>
     <w:p>
@@ -561,7 +561,7 @@
           <w:color w:val="1A1A1A"/>
           <w:sz w:val="22"/>
         </w:rPr>
-        <w:t xml:space="preserve">  Google Ads (extractor MCC): $6,705 · 242 conv · 3 campañas</w:t>
+        <w:t xml:space="preserve">  Google Ads (extractor MCC): $6,704 · 258 conv · 3 campañas</w:t>
       </w:r>
     </w:p>
     <w:p>
@@ -618,7 +618,7 @@
           <w:color w:val="1A1A1A"/>
           <w:sz w:val="22"/>
         </w:rPr>
-        <w:t xml:space="preserve">  Google Ads (extractor MCC): $1,195 · 0 conv · 2 campañas</w:t>
+        <w:t xml:space="preserve">  Google Ads (extractor MCC): $1,195 · 4,775 conv · 2 campañas</w:t>
       </w:r>
     </w:p>
     <w:p>
@@ -675,7 +675,7 @@
           <w:color w:val="1A1A1A"/>
           <w:sz w:val="22"/>
         </w:rPr>
-        <w:t xml:space="preserve">  Google Ads (extractor MCC): $1,381 · 2 conv · 3 campañas</w:t>
+        <w:t xml:space="preserve">  Google Ads (extractor MCC): $1,381 · 1,893 conv · 3 campañas</w:t>
       </w:r>
     </w:p>
     <w:p>
@@ -869,7 +869,7 @@
           <w:color w:val="1A1A1A"/>
           <w:sz w:val="26"/>
         </w:rPr>
-        <w:t>Investigar caída sostenida en Autos: -112pp desde el pico (nov 2025)</w:t>
+        <w:t>Investigar caída sostenida en Autos: -94pp desde el pico (nov 2025)</w:t>
       </w:r>
     </w:p>
     <w:p>
@@ -902,7 +902,7 @@
           <w:color w:val="1A1A1A"/>
           <w:sz w:val="22"/>
         </w:rPr>
-        <w:t xml:space="preserve">   ¿Por qué? En nov 2025 el cumplimiento fue 168.3% con CPL $3.83. Hoy (abr 2026) está en 56.7% con CPL $6.51. La caída es estructural (&gt;5 meses), no estacional.</w:t>
+        <w:t xml:space="preserve">   ¿Por qué? En nov 2025 el cumplimiento fue 168.3% con CPL $3.83. Hoy (abr 2026) está en 73.9% con CPL $5.17. La caída es estructural (&gt;5 meses), no estacional.</w:t>
       </w:r>
     </w:p>
     <w:p>
@@ -913,7 +913,7 @@
           <w:color w:val="1A1A1A"/>
           <w:sz w:val="22"/>
         </w:rPr>
-        <w:t xml:space="preserve">   Impacto: ALTO - recuperar 56pp del cumplimiento implica +5,475 leads/mes</w:t>
+        <w:t xml:space="preserve">   Impacto: ALTO - recuperar 47pp del cumplimiento implica +4,632 leads/mes</w:t>
       </w:r>
     </w:p>
     <w:p/>
@@ -940,7 +940,7 @@
           <w:color w:val="1A1A1A"/>
           <w:sz w:val="26"/>
         </w:rPr>
-        <w:t>Investigar caída sostenida en Motos: -112pp desde el pico (jun 2025)</w:t>
+        <w:t>Investigar caída sostenida en Motos: -98pp desde el pico (jun 2025)</w:t>
       </w:r>
     </w:p>
     <w:p>
@@ -973,7 +973,7 @@
           <w:color w:val="1A1A1A"/>
           <w:sz w:val="22"/>
         </w:rPr>
-        <w:t xml:space="preserve">   ¿Por qué? En jun 2025 el cumplimiento fue 167.1% con CPL $1.75. Hoy (abr 2026) está en 55.4% con CPL $2.76. La caída es estructural (&gt;5 meses), no estacional.</w:t>
+        <w:t xml:space="preserve">   ¿Por qué? En jun 2025 el cumplimiento fue 167.1% con CPL $1.75. Hoy (abr 2026) está en 69.5% con CPL $2.29. La caída es estructural (&gt;5 meses), no estacional.</w:t>
       </w:r>
     </w:p>
     <w:p>
@@ -984,7 +984,7 @@
           <w:color w:val="1A1A1A"/>
           <w:sz w:val="22"/>
         </w:rPr>
-        <w:t xml:space="preserve">   Impacto: ALTO - recuperar 56pp del cumplimiento implica +8,046 leads/mes</w:t>
+        <w:t xml:space="preserve">   Impacto: ALTO - recuperar 49pp del cumplimiento implica +7,026 leads/mes</w:t>
       </w:r>
     </w:p>
     <w:p/>
@@ -1011,7 +1011,7 @@
           <w:color w:val="1A1A1A"/>
           <w:sz w:val="26"/>
         </w:rPr>
-        <w:t>Investigar caída sostenida en Arrendamiento: -140pp desde el pico (jun 2025)</w:t>
+        <w:t>Investigar caída sostenida en Arrendamiento: -131pp desde el pico (jun 2025)</w:t>
       </w:r>
     </w:p>
     <w:p>
@@ -1044,7 +1044,7 @@
           <w:color w:val="1A1A1A"/>
           <w:sz w:val="22"/>
         </w:rPr>
-        <w:t xml:space="preserve">   ¿Por qué? En jun 2025 el cumplimiento fue 172.2% con CPL $2.22. Hoy (abr 2026) está en 32.2% con CPL $6.99. La caída es estructural (&gt;5 meses), no estacional.</w:t>
+        <w:t xml:space="preserve">   ¿Por qué? En jun 2025 el cumplimiento fue 172.2% con CPL $2.22. Hoy (abr 2026) está en 41.6% con CPL $5.58. La caída es estructural (&gt;5 meses), no estacional.</w:t>
       </w:r>
     </w:p>
     <w:p>
@@ -1055,7 +1055,7 @@
           <w:color w:val="1A1A1A"/>
           <w:sz w:val="22"/>
         </w:rPr>
-        <w:t xml:space="preserve">   Impacto: ALTO - recuperar 70pp del cumplimiento implica +11,488 leads/mes</w:t>
+        <w:t xml:space="preserve">   Impacto: ALTO - recuperar 65pp del cumplimiento implica +10,714 leads/mes</w:t>
       </w:r>
     </w:p>
     <w:p/>
@@ -1082,7 +1082,7 @@
           <w:color w:val="1A1A1A"/>
           <w:sz w:val="26"/>
         </w:rPr>
-        <w:t>Investigar caída sostenida en Viajes: -144pp desde el pico (jun 2025)</w:t>
+        <w:t>Investigar caída sostenida en Viajes: -131pp desde el pico (jun 2025)</w:t>
       </w:r>
     </w:p>
     <w:p>
@@ -1115,7 +1115,7 @@
           <w:color w:val="1A1A1A"/>
           <w:sz w:val="22"/>
         </w:rPr>
-        <w:t xml:space="preserve">   ¿Por qué? En jun 2025 el cumplimiento fue 186.7% con CPL $1.50. Hoy (abr 2026) está en 43.0% con CPL $8.43. La caída es estructural (&gt;5 meses), no estacional.</w:t>
+        <w:t xml:space="preserve">   ¿Por qué? En jun 2025 el cumplimiento fue 186.7% con CPL $1.50. Hoy (abr 2026) está en 55.6% con CPL $6.82. La caída es estructural (&gt;5 meses), no estacional.</w:t>
       </w:r>
     </w:p>
     <w:p>
@@ -1126,7 +1126,7 @@
           <w:color w:val="1A1A1A"/>
           <w:sz w:val="22"/>
         </w:rPr>
-        <w:t xml:space="preserve">   Impacto: ALTO - recuperar 72pp del cumplimiento implica +1,917 leads/mes</w:t>
+        <w:t xml:space="preserve">   Impacto: ALTO - recuperar 66pp del cumplimiento implica +1,750 leads/mes</w:t>
       </w:r>
     </w:p>
     <w:p/>
@@ -1186,7 +1186,7 @@
           <w:color w:val="1A1A1A"/>
           <w:sz w:val="22"/>
         </w:rPr>
-        <w:t xml:space="preserve">   ¿Por qué? Estado: 'Se han rechazado algunos anuncios'. Inversion ya gastada $12,382 con limitaciones - hay headroom inmediato al destrabar.</w:t>
+        <w:t xml:space="preserve">   ¿Por qué? Estado: 'Se han rechazado algunos anuncios'. Inversion ya gastada $12,383 con limitaciones - hay headroom inmediato al destrabar.</w:t>
       </w:r>
     </w:p>
     <w:p>
@@ -1257,7 +1257,7 @@
           <w:color w:val="1A1A1A"/>
           <w:sz w:val="22"/>
         </w:rPr>
-        <w:t xml:space="preserve">   ¿Por qué? Estado: 'Algunos grupos de recursos están limitados por una política'. Inversion ya gastada $10,671 con limitaciones - hay headroom inmediato al destrabar.</w:t>
+        <w:t xml:space="preserve">   ¿Por qué? Estado: 'Algunos grupos de recursos están limitados por una política'. Inversion ya gastada $10,672 con limitaciones - hay headroom inmediato al destrabar.</w:t>
       </w:r>
     </w:p>
     <w:p>
@@ -1295,7 +1295,7 @@
           <w:color w:val="1A1A1A"/>
           <w:sz w:val="26"/>
         </w:rPr>
-        <w:t>Escalar SURA_AUTOS_PMAX (+30% budget) - CPA $3.91 y headroom 74%</w:t>
+        <w:t>Escalar SURA_SALUDPARADOS_SEARCH_RETENTION (+30% budget) - CPA $0.19 y headroom 15%</w:t>
       </w:r>
     </w:p>
     <w:p>
@@ -1306,7 +1306,7 @@
           <w:color w:val="1A1A1A"/>
           <w:sz w:val="22"/>
         </w:rPr>
-        <w:t xml:space="preserve">   Seguro: Autos · Plataforma: Google Ads · Esfuerzo: bajo · Plazo: hoy</w:t>
+        <w:t xml:space="preserve">   Seguro: Salud para Dos · Plataforma: Google Ads · Esfuerzo: bajo · Plazo: hoy</w:t>
       </w:r>
     </w:p>
     <w:p>
@@ -1317,7 +1317,7 @@
           <w:color w:val="1A1A1A"/>
           <w:sz w:val="22"/>
         </w:rPr>
-        <w:t xml:space="preserve">   ¿Qué hacer? Subir presupuesto diario de $517.00 a $672.10 (+30%). La campania pierde 74% de impresiones por falta de presupuesto.</w:t>
+        <w:t xml:space="preserve">   ¿Qué hacer? Subir presupuesto diario de $25.00 a $32.50 (+30%). La campania pierde 15% de impresiones por falta de presupuesto.</w:t>
       </w:r>
     </w:p>
     <w:p>
@@ -1328,7 +1328,7 @@
           <w:color w:val="1A1A1A"/>
           <w:sz w:val="22"/>
         </w:rPr>
-        <w:t xml:space="preserve">   ¿Por qué? CPA $3.91 entre los mejores. 2,726 conversiones con $10,671. Cuota perdida por presupuesto = 74% indica que con mas budget escalaria a CPA similar.</w:t>
+        <w:t xml:space="preserve">   ¿Por qué? CPA $0.19 entre los mejores. 4,102 conversiones con $779. Cuota perdida por presupuesto = 15% indica que con mas budget escalaria a CPA similar.</w:t>
       </w:r>
     </w:p>
     <w:p>
@@ -1339,7 +1339,7 @@
           <w:color w:val="1A1A1A"/>
           <w:sz w:val="22"/>
         </w:rPr>
-        <w:t xml:space="preserve">   Impacto: ALTO - estimado +817 conversiones extra/mes</w:t>
+        <w:t xml:space="preserve">   Impacto: ALTO - estimado +1,230 conversiones extra/mes</w:t>
       </w:r>
     </w:p>
     <w:p/>
@@ -1532,7 +1532,7 @@
           <w:color w:val="1A1A1A"/>
           <w:sz w:val="22"/>
         </w:rPr>
-        <w:t>Cumplimiento global 46.1% (RECIBIDOS SF / REQUERIDOS) vs 70% transcurrido del mes. 19,971 leads reales recibidos de 43,290 requeridos. Inversion $104,893 (Google 74% / Meta 24%). CPL Negocio $5.25.</w:t>
+        <w:t>Cumplimiento global 59.1% (RECIBIDOS SF / REQUERIDOS) vs 70% transcurrido del mes. 25,582 leads reales recibidos de 43,290 requeridos. Inversion $108,713 (Google 71% / Meta 26%). CPL Negocio $4.25.</w:t>
       </w:r>
     </w:p>
     <w:p>
@@ -1556,7 +1556,7 @@
           <w:color w:val="1A1A1A"/>
           <w:sz w:val="22"/>
         </w:rPr>
-        <w:t>Aplicando las top 5 recomendaciones (focalizadas en destrabar bloqueos administrativos, recuperar configuraciones que rendían en el pico de Q4 2025 y arreglar tracking) estimamos +20pp de cumplimiento global en 4 semanas (de 46% a 66%) y 8,658 leads SF adicionales/mes.</w:t>
+        <w:t>Aplicando las top 5 recomendaciones (focalizadas en destrabar bloqueos administrativos, recuperar configuraciones que rendían en el pico de Q4 2025 y arreglar tracking) estimamos +20pp de cumplimiento global en 4 semanas (de 59% a 79%) y 8,658 leads SF adicionales/mes.</w:t>
       </w:r>
     </w:p>
     <w:p>
@@ -1594,7 +1594,7 @@
           <w:color w:val="6B7280"/>
           <w:sz w:val="18"/>
         </w:rPr>
-        <w:t>Beyond Media Agency · 2026-04-27T11:27:04</w:t>
+        <w:t>Beyond Media Agency · 2026-04-27T15:59:28</w:t>
       </w:r>
     </w:p>
     <w:sectPr>

</xml_diff>